<commit_message>
fix: resume/intro — generalize SEED-specific phrasing for universal submission
Co-Authored-By: Claude Fable 5 <noreply@anthropic.com>
</commit_message>
<xml_diff>
--- a/reports/사역소개서,이력서,신앙간증문,사역계획서/이력서및자기소개서_김우진, 서진아 선교사.docx
+++ b/reports/사역소개서,이력서,신앙간증문,사역계획서/이력서및자기소개서_김우진, 서진아 선교사.docx
@@ -2882,23 +2882,23 @@
         <w:jc w:val="both"/>
       </w:pPr>
       <w:r>
-        <w:t xml:space="preserve">주님의 은혜로 살아가는 하나님의 자녀, 김우진 선교사입니다. 저와 저희 가족은 2016년부터 중남미 온두라스에서 파송 선교사로 사역하며, 하나님께서 주신 부르심에 순종하여 오늘도 복음을 삶으로 살아내기 위해 애쓰고 있습니다. 하나님께서 어떻게 저를 불러 주셨고 어떤 길을 걸어 오늘에 이르렀는지를 말씀드리며, </w:t>
+        <w:t xml:space="preserve">주님의 은혜로 살아가는 하나님의 자녀, 김우진 선교사입니다. 저와 저희 가족은 2016년부터 중남미 온두라스에서 파송 선교사로 사역하며, 하나님께서 주신 부르심에 순종하여 오늘도 복음을 삶으로 살아내기 위해 애쓰고 있습니다. 하나님께서 어떻게 저를 불러 주셨고 어떤 길을 걸어 오늘에 이르렀는지를 말씀드리고자 이 글을 드립니다.</w:t>
       </w:r>
       <w:proofErr w:type="spellStart"/>
       <w:r>
-        <w:t>시드선교회와</w:t>
+        <w:t xml:space="preserve"/>
       </w:r>
       <w:proofErr w:type="spellEnd"/>
       <w:r>
-        <w:t xml:space="preserve"> 함께 </w:t>
+        <w:t xml:space="preserve"/>
       </w:r>
       <w:proofErr w:type="spellStart"/>
       <w:r>
-        <w:t>동역하기를</w:t>
+        <w:t xml:space="preserve"/>
       </w:r>
       <w:proofErr w:type="spellEnd"/>
       <w:r>
-        <w:t xml:space="preserve"> 소망하는 마음으로 이 글을 드립니다.</w:t>
+        <w:t xml:space="preserve"/>
       </w:r>
     </w:p>
     <w:p>
@@ -3306,7 +3306,7 @@
           <w:sz w:val="23"/>
           <w:szCs w:val="23"/>
         </w:rPr>
-        <w:t xml:space="preserve">5. 전임 사역의 시작과 </w:t>
+        <w:t xml:space="preserve">5. 전임 사역의 시작과 새로운 소망</w:t>
       </w:r>
       <w:proofErr w:type="spellStart"/>
       <w:r>
@@ -3316,7 +3316,7 @@
           <w:sz w:val="23"/>
           <w:szCs w:val="23"/>
         </w:rPr>
-        <w:t>시드선교회를</w:t>
+        <w:t xml:space="preserve"/>
       </w:r>
       <w:proofErr w:type="spellEnd"/>
       <w:r>
@@ -3326,7 +3326,7 @@
           <w:sz w:val="23"/>
           <w:szCs w:val="23"/>
         </w:rPr>
-        <w:t xml:space="preserve"> 향한 소망</w:t>
+        <w:t xml:space="preserve"/>
       </w:r>
     </w:p>
     <w:p>
@@ -3372,31 +3372,31 @@
         <w:jc w:val="both"/>
       </w:pPr>
       <w:r>
-        <w:t xml:space="preserve">이 글이 저 자신을 다시 하나님 앞에 세우는 고백의 자리가 되기를 원합니다. 부족한 저를 하나님의 일꾼으로 세워 가시는 여정 속에서, </w:t>
+        <w:t xml:space="preserve">이 글이 저 자신을 다시 하나님 앞에 세우는 고백의 자리가 되기를 원합니다. 부족한 저를 하나님의 일꾼으로 세워 가시는 여정 속에서, 동역하는 교회들과 한마음으로, 온두라스 땅에 복음의 씨앗을 심는 일에 쓰임받기를 진심으로 소망합니다. 감사합니다.</w:t>
       </w:r>
       <w:proofErr w:type="spellStart"/>
       <w:r>
-        <w:t>시드선교회와</w:t>
+        <w:t xml:space="preserve"/>
       </w:r>
       <w:proofErr w:type="spellEnd"/>
       <w:r>
-        <w:t xml:space="preserve"> 한마음으로 </w:t>
+        <w:t xml:space="preserve"/>
       </w:r>
       <w:proofErr w:type="spellStart"/>
       <w:r>
-        <w:t>동역하며</w:t>
+        <w:t xml:space="preserve"/>
       </w:r>
       <w:proofErr w:type="spellEnd"/>
       <w:r>
-        <w:t xml:space="preserve"> 온두라스 땅에 복음의 씨앗을 심는 일에 </w:t>
+        <w:t xml:space="preserve"/>
       </w:r>
       <w:proofErr w:type="spellStart"/>
       <w:r>
-        <w:t>쓰임받기를</w:t>
+        <w:t xml:space="preserve"/>
       </w:r>
       <w:proofErr w:type="spellEnd"/>
       <w:r>
-        <w:t xml:space="preserve"> 진심으로 소망합니다. 감사합니다.</w:t>
+        <w:t xml:space="preserve"/>
       </w:r>
     </w:p>
     <w:p>
@@ -7083,23 +7083,23 @@
         <w:jc w:val="both"/>
       </w:pPr>
       <w:r>
-        <w:t>온두라스에서의 삶이 이제 10년째에 접어들었습니다. 이곳에서 제가 가장 깊이 배운 것은 '내가 무엇을 원하는가'가 아니라 '하나님께서 무엇을 원하시는가'</w:t>
+        <w:t xml:space="preserve">온두라스에서의 삶이 이제 10년째에 접어들었습니다. 이곳에서 제가 가장 깊이 배운 것은 '내가 무엇을 원하는가'가 아니라 '하나님께서 무엇을 원하시는가'에 귀 기울이는 것입니다. 지금도 부족함이 많고 시행착오도 많지만, 지금까지 저 같은 연약한 사람을 빚어 오신 하나님께서 앞으로도 인도하시고 성숙하게 하시리라 믿습니다. 앞으로 걷게 될 여정에도 그 하나님을 신뢰하며, 맡겨 주신 자리에서 신실하게 섬기겠습니다. 감사합니다.</w:t>
       </w:r>
       <w:proofErr w:type="spellStart"/>
       <w:r>
-        <w:t>에</w:t>
+        <w:t xml:space="preserve"/>
       </w:r>
       <w:proofErr w:type="spellEnd"/>
       <w:r>
-        <w:t xml:space="preserve"> 귀 기울이는 것입니다. 지금도 부족함이 많고 시행착오도 많지만, 지금까지 저 같은 연약한 사람을 빚어 오신 하나님께서 앞으로도 인도하시고 성숙하게 하시리라 믿습니다. </w:t>
+        <w:t xml:space="preserve"/>
       </w:r>
       <w:proofErr w:type="spellStart"/>
       <w:r>
-        <w:t>시드선교회와</w:t>
+        <w:t xml:space="preserve"/>
       </w:r>
       <w:proofErr w:type="spellEnd"/>
       <w:r>
-        <w:t xml:space="preserve"> 함께 걷게 될 앞으로의 여정에도 그 하나님을 신뢰하며, 맡겨 주신 자리에서 신실하게 섬기겠습니다. 감사합니다.</w:t>
+        <w:t xml:space="preserve"/>
       </w:r>
     </w:p>
     <w:p>

</xml_diff>